<commit_message>
Fix Circle introduction order (Ch17, Ch18) and unnamed photograph in Ch30
Co-Authored-By: Claude Sonnet 5.5 <noreply@anthropic.com>

Claude-Session: https://claude.ai/code/session_011sBVAmX35tPxqRASXqkfKn
</commit_message>
<xml_diff>
--- a/01_The_Blue_Silence/Manuscript/THE_BLUE_SILENCE_Chapter_18_The_Second_Envelope.docx
+++ b/01_The_Blue_Silence/Manuscript/THE_BLUE_SILENCE_Chapter_18_The_Second_Envelope.docx
@@ -1414,7 +1414,7 @@
     <w:p>
       <w:pPr/>
       <w:r>
-        <w:t>Aisyah added, “And do not call Amirul Circle.”</w:t>
+        <w:t>Aisyah added, “And do not call Amirul part of anything. Not yet.”</w:t>
       </w:r>
     </w:p>
     <w:p>
@@ -1426,7 +1426,7 @@
     <w:p>
       <w:pPr/>
       <w:r>
-        <w:t>“Who said Circle?”</w:t>
+        <w:t>“Part of what?”</w:t>
       </w:r>
     </w:p>
     <w:p>
@@ -1438,7 +1438,7 @@
     <w:p>
       <w:pPr/>
       <w:r>
-        <w:t>The word had not yet been spoken inside ORION as a formal label.</w:t>
+        <w:t>Nobody inside ORION had yet given the thing a name.</w:t>
       </w:r>
     </w:p>
     <w:p>
@@ -2422,7 +2422,7 @@
     <w:p>
       <w:pPr/>
       <w:r>
-        <w:t>Not because it proved The Circle.</w:t>
+        <w:t>Not because it proved a conspiracy.</w:t>
       </w:r>
     </w:p>
     <w:p>

</xml_diff>